<commit_message>
v57: update guides and PDF for header add icon, icon-only save, map pin
Co-authored-by: Copilot <223556219+Copilot@users.noreply.github.com>
</commit_message>
<xml_diff>
--- a/docs/Return Visits App User Guide.docx
+++ b/docs/Return Visits App User Guide.docx
@@ -162,7 +162,7 @@
         <w:pStyle w:val="ListBullet"/>
       </w:pPr>
       <w:r>
-        <w:t>Choose Save to keep your changes. To edit an existing contact, use the pencil/edit action on their contact card. Choose Navigate on a contact card to open Google Maps directions; saved coordinates are used when available, otherwise the contact address is used. Choose Share and then Text / SMS, WhatsApp, or Email to prepare a plain-text summary with the contact's available details and directions link. Visit notes are not included. This is not encrypted by the app; use Export for encrypted app-to-app transfer. Review the message in the selected app before sending.</w:t>
+        <w:t>Choose the Save (disk) icon at the bottom of the editor to keep your changes. Next to the title at the top, the + icon starts another new contact without leaving the editor, and the ? closes it. In the bottom bar, the arrow icon opens Google Maps directions to the contact. To edit an existing contact, use the pencil/edit action on their contact card. Choose Navigate on a contact card to open Google Maps directions; saved coordinates are used when available, otherwise the contact address is used. Choose Share and then Text / SMS, WhatsApp, or Email to prepare a plain-text summary with the contact's available details and directions link. Visit notes are not included. This is not encrypted by the app; use Export for encrypted app-to-app transfer. Review the message in the selected app before sending.</w:t>
       </w:r>
     </w:p>
     <w:p>
@@ -170,7 +170,7 @@
         <w:pStyle w:val="ListBullet"/>
       </w:pPr>
       <w:r>
-        <w:t>If you choose Exit or close the editor after making changes, the app asks whether to leave without saving. Confirming discards those changes; canceling keeps the editor open.</w:t>
+        <w:t>If you choose the ? or close the editor after making changes, the app asks whether to leave without saving. Confirming discards those changes; canceling keeps the editor open.</w:t>
       </w:r>
     </w:p>
     <w:p>
@@ -178,7 +178,7 @@
         <w:pStyle w:val="ListBullet"/>
       </w:pPr>
       <w:r>
-        <w:t>Use the Map button in the bottom navigation to view contacts that match the current search and filters and have map coordinates. Changing the search or filters also updates the map. Contacts without coordinates do not have a pin on the map. Whenever the Map is open with no visible contact pins, it centers approximately on the Default City and State in Settings and sends that city and state to OpenStreetMap Nominatim for the lookup. Choose Navigate in a map pin popup to open directions in Google Maps. Drag a pin on this page to move it; the new coordinates save automatically.</w:t>
+        <w:t>Use the round blue Map pin in the bottom navigation to view contacts that match the current search and filters and have map coordinates. Changing the search or filters also updates the map. Contacts without coordinates do not have a pin on the map. Whenever the Map is open with no visible contact pins, it centers approximately on the Default City and State in Settings and sends that city and state to OpenStreetMap Nominatim for the lookup. Choose Navigate in a map pin popup to open directions in Google Maps. Drag a pin on this page to move it; the new coordinates save automatically. The map opens zoomed to show every pin it will display.</w:t>
       </w:r>
     </w:p>
     <w:p>

</xml_diff>

<commit_message>
Auto-merge Dropbox sync with offline holding, sync icon, ADD VISIT button, RVs header titles
Co-authored-by: Copilot <223556219+Copilot@users.noreply.github.com>
</commit_message>
<xml_diff>
--- a/docs/Return Visits App User Guide.docx
+++ b/docs/Return Visits App User Guide.docx
@@ -260,7 +260,7 @@
         <w:pStyle w:val="ListBullet"/>
       </w:pPr>
       <w:r>
-        <w:t>On the contact card, choose the plus button, adjust the date and time if needed, add an optional note, and choose Save Visit. The card then shows the newest visit and its note; earlier visits stay in the contact editor's visit log. In the contact editor, enter a note and choose Save; you can adjust its date and time there. Existing notes can be edited or deleted from the contact editor. To dictate a note instead of typing, tap the microphone key on your phone or tablet keyboard while the note field is selected. On iPhone and iPad, turn it on in Settings ? General ? Keyboard ? Enable Dictation if you do not see it. The app does not record audio itself; your device handles the dictation and may send speech to Apple or Google depending on its settings.</w:t>
+        <w:t>On the contact card, choose the ADD VISIT button, adjust the date and time if needed, add an optional note, and choose Save Visit. The card then shows the newest visit and its note; earlier visits stay in the contact editor's visit log. In the contact editor, enter a note and choose Save; you can adjust its date and time there. Existing notes can be edited or deleted from the contact editor. To dictate a note instead of typing, tap the microphone key on your phone or tablet keyboard while the note field is selected. On iPhone and iPad, turn it on in Settings ? General ? Keyboard ? Enable Dictation if you do not see it. The app does not record audio itself; your device handles the dictation and may send speech to Apple or Google depending on its settings.</w:t>
       </w:r>
     </w:p>
     <w:p>
@@ -366,7 +366,7 @@
     </w:p>
     <w:p>
       <w:r>
-        <w:t>Cloud backup keeps a copy of your contacts and settings in your own Dropbox account, outside your phone. If your phone is lost, broken or replaced, you can restore from Dropbox instead of needing a file you saved earlier. It is off unless you turn it on, and the file backups above keep working either way.</w:t>
+        <w:t>Cloud backup keeps a copy of your contacts and settings in your own Dropbox account, outside your phone. If your phone is lost, broken or replaced, you can restore from Dropbox instead of needing a file you saved earlier. It is off unless you turn it on. Dropbox is entirely optional: the app works fully without it, and all your data can stay only on this device, and the file backups above keep working either way.</w:t>
       </w:r>
     </w:p>
     <w:p>
@@ -443,7 +443,7 @@
         <w:pStyle w:val="ListBullet"/>
       </w:pPr>
       <w:r>
-        <w:t>The app never replaces your Dropbox copy with an empty one; it does not back up automatically when this device has no contacts. With more than one device, each device checks Dropbox when you open the app (and when you return to it after a few minutes). If Dropbox has a newer backup from another device, the app asks whether to restore it; it never replaces anything without asking. You can also choose Check for a Newer Backup. After making changes on one device, wait about 15 seconds or close the app so its backup finishes before you open the other device. If you decline, automatic backup stays paused so the newer copy is not overwritten; Back Up to Dropbox Now replaces the Dropbox copy on purpose (older dated copies stay). Changes made on two devices are not merged; you choose which copy to keep.</w:t>
+        <w:t>The app never replaces your Dropbox copy with an empty one; it does not back up automatically when this device has no contacts. With more than one device, each device combines its changes with Dropbox automatically: when you open the app, every couple of minutes while it is open, and as soon as the connection returns after being offline. Visits and contacts added on different devices are all kept. If you have no signal, your changes stay saved on the device and upload as soon as it can reach Dropbox. A cloud icon at the top of the app shows the state (synced, syncing, waiting to upload, offline or paused); tap it to sync now. You can also choose Check for a Newer Backup. If two devices change the very same contact at the same time, the most recent change to that contact is used, but visits from both devices are kept. If a Dropbox copy uses a different passphrase it cannot be combined automatically; the app then asks whether to restore it, and automatic backup stays paused until you do (Back Up to Dropbox Now replaces the Dropbox copy on purpose; older dated copies stay). A city, region or area you delete on one device can reappear from another.</w:t>
       </w:r>
     </w:p>
     <w:p>

</xml_diff>

<commit_message>
Docs: syncing between devices, same passphrase rule, optional Dropbox
Co-authored-by: Copilot <223556219+Copilot@users.noreply.github.com>
</commit_message>
<xml_diff>
--- a/docs/Return Visits App User Guide.docx
+++ b/docs/Return Visits App User Guide.docx
@@ -366,7 +366,7 @@
     </w:p>
     <w:p>
       <w:r>
-        <w:t>Cloud backup keeps a copy of your contacts and settings in your own Dropbox account, outside your phone. If your phone is lost, broken or replaced, you can restore from Dropbox instead of needing a file you saved earlier. It is off unless you turn it on. Dropbox is entirely optional: the app works fully without it, and all your data can stay only on this device, and the file backups above keep working either way.</w:t>
+        <w:t>Cloud backup keeps a copy of your contacts and settings in your own Dropbox account, outside your phone. If your phone is lost, broken or replaced, you can restore from Dropbox instead of needing a file you saved earlier. If you connect more than one device to the same Dropbox, it also keeps them in step (see Syncing between devices below). It is off unless you turn it on. Dropbox is entirely optional: the app works fully without it, nothing is sent anywhere, and all your data can stay only on this device. The file backups above keep working either way.</w:t>
       </w:r>
     </w:p>
     <w:p>
@@ -403,7 +403,7 @@
         <w:pStyle w:val="ListBullet"/>
       </w:pPr>
       <w:r>
-        <w:t>The app backs up when you open it if your last Dropbox backup is more than a day old, and about 15 seconds after you make changes or as you leave the app. A web app cannot back up while it is closed.</w:t>
+        <w:t>The app checks Dropbox when you open it, and backs up about 15 seconds after you make changes or as you leave the app. While it is open it also checks every couple of minutes. A web app cannot back up while it is closed, so this happens when you use it.</w:t>
       </w:r>
     </w:p>
     <w:p>
@@ -443,7 +443,135 @@
         <w:pStyle w:val="ListBullet"/>
       </w:pPr>
       <w:r>
-        <w:t>The app never replaces your Dropbox copy with an empty one; it does not back up automatically when this device has no contacts. With more than one device, each device combines its changes with Dropbox automatically: when you open the app, every couple of minutes while it is open, and as soon as the connection returns after being offline. Visits and contacts added on different devices are all kept. If you have no signal, your changes stay saved on the device and upload as soon as it can reach Dropbox. A cloud icon at the top of the app shows the state (synced, syncing, waiting to upload, offline or paused); tap it to sync now. You can also choose Check for a Newer Backup. If two devices change the very same contact at the same time, the most recent change to that contact is used, but visits from both devices are kept. If a Dropbox copy uses a different passphrase it cannot be combined automatically; the app then asks whether to restore it, and automatic backup stays paused until you do (Back Up to Dropbox Now replaces the Dropbox copy on purpose; older dated copies stay). A city, region or area you delete on one device can reappear from another.</w:t>
+        <w:t>The app never replaces your Dropbox copy with an empty one; it does not back up automatically when this device has no contacts. Using more than one device is covered next, under Syncing between devices.</w:t>
+      </w:r>
+    </w:p>
+    <w:p>
+      <w:pPr>
+        <w:pStyle w:val="Heading2"/>
+      </w:pPr>
+      <w:r>
+        <w:t>Syncing between devices</w:t>
+      </w:r>
+    </w:p>
+    <w:p>
+      <w:pPr/>
+      <w:r>
+        <w:t>Syncing is part of Dropbox backup. If you do not connect Dropbox, nothing syncs: your contacts stay only on that device, and each device is separate. If you connect every device to the same Dropbox, they combine their changes automatically.</w:t>
+      </w:r>
+    </w:p>
+    <w:p>
+      <w:pPr/>
+      <w:r>
+        <w:t>Important: all devices that sync together must use the same passphrase and the same recovery code. Dropbox and your device sign-in are the only protection the app requires. A passphrase is only needed if you want your Dropbox copies encrypted; turn it on once, on your main device.</w:t>
+      </w:r>
+    </w:p>
+    <w:p>
+      <w:pPr/>
+      <w:r>
+        <w:t>Setting up a second device (for example an iPad):</w:t>
+      </w:r>
+    </w:p>
+    <w:p>
+      <w:pPr>
+        <w:ind w:left="360"/>
+      </w:pPr>
+      <w:r>
+        <w:t>Step 1. On your main device (the one that has your contacts), make a file backup first. If you want encrypted Dropbox copies, turn on the passphrase now under Settings → Passphrase and save the recovery code. Then connect Dropbox as described above and wait for the cloud icon to show it is synced.</w:t>
+      </w:r>
+    </w:p>
+    <w:p>
+      <w:pPr>
+        <w:ind w:left="360"/>
+      </w:pPr>
+      <w:r>
+        <w:t>Step 2. On the second device, install or update the app, open Settings → Cloud backup (optional) and connect to the same Dropbox account. Do not turn on a passphrase there first.</w:t>
+      </w:r>
+    </w:p>
+    <w:p>
+      <w:pPr>
+        <w:ind w:left="360"/>
+      </w:pPr>
+      <w:r>
+        <w:t>Step 3. When the app says Dropbox already has a backup, choose Restore, not Replace. Pick the latest copy. If it is encrypted, enter the passphrase or recovery code from your main device; the second device then uses that same passphrase and recovery code.</w:t>
+      </w:r>
+    </w:p>
+    <w:p>
+      <w:pPr>
+        <w:ind w:left="360"/>
+      </w:pPr>
+      <w:r>
+        <w:t>Step 4. Your contacts appear and the cloud icon shows it is synced. After this the two devices stay in step by themselves.</w:t>
+      </w:r>
+    </w:p>
+    <w:p>
+      <w:pPr/>
+      <w:r>
+        <w:t>Day to day:</w:t>
+      </w:r>
+    </w:p>
+    <w:p>
+      <w:pPr>
+        <w:pStyle w:val="ListBullet"/>
+      </w:pPr>
+      <w:r>
+        <w:t>Each device combines with Dropbox when you open the app, about every couple of minutes while it is open, and as soon as a lost connection returns. After you make a change, wait about 15 seconds before switching to the other device.</w:t>
+      </w:r>
+    </w:p>
+    <w:p>
+      <w:pPr>
+        <w:pStyle w:val="ListBullet"/>
+      </w:pPr>
+      <w:r>
+        <w:t>Contacts and visits added on different devices are all kept. Deleting a contact or a visit on one device removes it on the others.</w:t>
+      </w:r>
+    </w:p>
+    <w:p>
+      <w:pPr>
+        <w:pStyle w:val="ListBullet"/>
+      </w:pPr>
+      <w:r>
+        <w:t>If two devices change the very same contact at nearly the same time, the most recent change to that contact's details is used, but visits from both devices are kept.</w:t>
+      </w:r>
+    </w:p>
+    <w:p>
+      <w:pPr>
+        <w:pStyle w:val="ListBullet"/>
+      </w:pPr>
+      <w:r>
+        <w:t>With no signal, your changes stay saved on the device and upload automatically when it can reach Dropbox again.</w:t>
+      </w:r>
+    </w:p>
+    <w:p>
+      <w:pPr>
+        <w:pStyle w:val="ListBullet"/>
+      </w:pPr>
+      <w:r>
+        <w:t>The cloud icon at the top right shows the state: cloud = up to date, circular arrows = syncing, hourglass = changes waiting to upload, no-signal = no connection (your changes are kept), warning = paused and needs attention. Tap it to sync now and read the message. Check for a Newer Backup does the same from Settings.</w:t>
+      </w:r>
+    </w:p>
+    <w:p>
+      <w:pPr>
+        <w:pStyle w:val="ListBullet"/>
+      </w:pPr>
+      <w:r>
+        <w:t>If a device uses a different passphrase than the Dropbox copy, the app cannot combine them. It asks whether to restore the Dropbox copy and keeps automatic backup paused until you decide. Use Back Up to Dropbox Now only if you want this device's data to replace the Dropbox copy; older dated copies stay.</w:t>
+      </w:r>
+    </w:p>
+    <w:p>
+      <w:pPr>
+        <w:pStyle w:val="ListBullet"/>
+      </w:pPr>
+      <w:r>
+        <w:t>Connecting a device that already has contacts to a Dropbox that already has a backup asks whether to restore (replace this device) or replace the Dropbox copy. Choose carefully.</w:t>
+      </w:r>
+    </w:p>
+    <w:p>
+      <w:pPr>
+        <w:pStyle w:val="ListBullet"/>
+      </w:pPr>
+      <w:r>
+        <w:t>Limits: a city, region or area you delete on one device can come back from another, and renaming one can leave the old name behind. Settings other than those lists come from the device that changed them last.</w:t>
       </w:r>
     </w:p>
     <w:p>
@@ -462,7 +590,7 @@
     <w:p>
       <w:pPr/>
       <w:r>
-        <w:t>If Safari, Chrome, and a Home Screen app each contain contacts, they are separate copies and do not sync. For regular phone use, choose the Home Screen app as the one copy to keep. A full backup restore replaces the destination collection; it does not merge two backups.</w:t>
+        <w:t>If Safari, Chrome, and a Home Screen app each contain contacts, they are separate copies and do not sync, even if you use Dropbox on one of them. For regular phone use, choose the Home Screen app as the one copy to keep. A full backup restore replaces the destination collection; it does not merge two backups.</w:t>
       </w:r>
     </w:p>
     <w:p>

</xml_diff>

<commit_message>
Docs: reconcile sync wording across the user guide
Co-authored-by: Copilot <223556219+Copilot@users.noreply.github.com>
</commit_message>
<xml_diff>
--- a/docs/Return Visits App User Guide.docx
+++ b/docs/Return Visits App User Guide.docx
@@ -56,7 +56,7 @@
     <w:p>
       <w:pPr/>
       <w:r>
-        <w:t>Contacts and settings are stored in the browser on the device where you use the app. They do not automatically sync to your other devices or browsers. You can optionally turn on a backup to your own Dropbox; see "Cloud backup (optional)".</w:t>
+        <w:t>Contacts and settings are stored in the browser on the device where you use the app. They do not sync to your other devices unless you choose to: you can optionally connect your own Dropbox, which backs up your contacts and keeps your devices in step; see "Cloud backup (optional)" and "Syncing between devices".</w:t>
       </w:r>
     </w:p>
     <w:p>
@@ -116,7 +116,7 @@
         <w:pStyle w:val="ListBullet"/>
       </w:pPr>
       <w:r>
-        <w:t>A passphrase does not sync or restore contacts by itself. To recover your contacts after reinstalling the app or to move them to another device, you need a backup. See "Protect your information and make a backup" below.</w:t>
+        <w:t>A passphrase does not sync or restore contacts by itself. To recover your contacts after reinstalling the app or to move them to another device, you need a backup (a file, or Dropbox). See "Protect your information and make a backup" below.</w:t>
       </w:r>
     </w:p>
     <w:p>
@@ -711,7 +711,7 @@
     </w:p>
     <w:p>
       <w:r>
-        <w:t>On another device, open the app at https://grasfulls.github.io/return-visits-app/ in a web browser. Your contacts will not appear automatically; restore an encrypted backup using the instructions in "Protect your information and make a backup" above. On a phone, you can optionally add the app to your Home Screen: in Safari on iPhone, use Share then Add to Home Screen; in Chrome on Android, choose Install app or Add to Home screen. The app checks for updates when it opens and prompts you once it has opened if an update is ready; an exclamation mark also appears by Settings. To check or refresh manually, open Settings → App updates and choose Check for Updates &amp; Refresh while online. If there is no update, a "No update available" message appears; tap OK to close it. Save or finish any open contact or Settings edits before refreshing. If something is unsaved, the app names the exact section and field and takes you to it. Leaving Settings with unsaved edits also asks "Discard unsaved changes?"; choose OK to discard them or Cancel to stay and finish. The app reloads its code while keeping the contacts and settings stored in that app copy on the device. After it reloads, unlock using the same passphrase if you have turned one on.</w:t>
+        <w:t>On another device, open the app at https://grasfulls.github.io/return-visits-app/ in a web browser. Your contacts will not appear automatically. If you use Dropbox, connect the same Dropbox account on the new device and restore from it; the devices then stay in step (see "Syncing between devices"). Otherwise restore a backup file using the instructions in "Protect your information and make a backup" above. On a phone, you can optionally add the app to your Home Screen: in Safari on iPhone, use Share then Add to Home Screen; in Chrome on Android, choose Install app or Add to Home screen. The app checks for updates when it opens and prompts you once it has opened if an update is ready; an exclamation mark also appears by Settings. To check or refresh manually, open Settings → App updates and choose Check for Updates &amp; Refresh while online. If there is no update, a "No update available" message appears; tap OK to close it. Save or finish any open contact or Settings edits before refreshing. If something is unsaved, the app names the exact section and field and takes you to it. Leaving Settings with unsaved edits also asks "Discard unsaved changes?"; choose OK to discard them or Cancel to stay and finish. The app reloads its code while keeping the contacts and settings stored in that app copy on the device. After it reloads, unlock using the same passphrase if you have turned one on.</w:t>
       </w:r>
     </w:p>
     <w:p>
@@ -725,13 +725,13 @@
     <w:p>
       <w:pPr/>
       <w:r>
-        <w:t>The browser version and the Home Screen app do not automatically sync their contacts. Adding the app to your Home Screen does not transfer the data already saved in your browser; the two versions may keep separate local copies. To move your contacts, first confirm they are visible in the browser version, then choose Settings → Backup &amp; Restore → Back up everything (or the export icon at the bottom of the contact list). Open the Home Screen app and choose Choose Backup to Restore on its unlock screen, or use its restore option in Settings. Keep using the browser copy until you have confirmed the contacts are visible in the Home Screen app. After the transfer, changes made in one copy will not appear in the other; export and restore a fresh backup when you want to move newer changes.</w:t>
+        <w:t>The browser version and the Home Screen app are separate copies and do not sync with each other, even if you use Dropbox in one of them. Adding the app to your Home Screen does not transfer the data already saved in your browser; the two versions may keep separate local copies. To move your contacts, first confirm they are visible in the browser version, then choose Settings → Backup &amp; Restore → Back up everything (or the export icon at the bottom of the contact list). Open the Home Screen app and choose Choose Backup to Restore on its unlock screen, or use its restore option in Settings. Keep using the browser copy until you have confirmed the contacts are visible in the Home Screen app. After the transfer, changes made in one copy will not appear in the other, so use only one of them from then on.</w:t>
       </w:r>
     </w:p>
     <w:p>
       <w:pPr/>
       <w:r>
-        <w:t>To avoid managing multiple copies, choose one browser or Home Screen app on one device as your regular place to use Return Visits. The app is free to use, but it does not include an online sync service; keeping separate copies up to date means manually exporting and restoring encrypted backups. If you use more than one copy, keep track of which one has your latest changes and restore carefully, because restoring a full backup replaces the destination copy's contacts and settings.</w:t>
+        <w:t>To avoid managing multiple copies, choose one browser or Home Screen app on one device as your regular place to use Return Visits. The app is free to use and has no sync service of its own; syncing happens only if you connect your own Dropbox on each device (see "Syncing between devices"). Without Dropbox, keeping separate copies up to date means manually exporting and restoring backups. If you use more than one copy, keep track of which one has your latest changes and restore carefully, because restoring a full backup replaces the destination copy's contacts and settings.</w:t>
       </w:r>
     </w:p>
     <w:sectPr>

</xml_diff>